<commit_message>
Tambah struktur organisasi kantor pusat dan cabang ke buku DAMRI
Bab IV kini memuat bagan kantor pusat tingkat Direksi (Dewan Pengawas,
Direktur Utama, Sekretariat Perusahaan, SPI, empat direktur), daftar
unit setingkat divisi, serta subbab 4.3 dengan bagan dan tabel tugas
kantor cabang (General Manager, Manager Usaha, Manager Keuangan, SDM
dan Umum, Manager Teknik). Bagan digambar ulang oleh build.sh.

Co-Authored-By: Claude Opus 5.5 <noreply@anthropic.com>
Claude-Session: https://claude.ai/code/session_013M5gm8oaPwmPnNYAzSPG91
</commit_message>
<xml_diff>
--- a/buku-damri/Pengetahuan-Seputar-DAMRI.docx
+++ b/buku-damri/Pengetahuan-Seputar-DAMRI.docx
@@ -818,7 +818,7 @@
       </w:pPr>
       <w:hyperlink w:anchor="_Toc000018" w:history="1">
         <w:r>
-          <w:t xml:space="preserve">4.1 Struktur Organisasi</w:t>
+          <w:t xml:space="preserve">4.1 Struktur Organisasi Kantor Pusat</w:t>
         </w:r>
         <w:r>
           <w:tab/>
@@ -861,7 +861,7 @@
           <w:fldChar w:fldCharType="separate"/>
         </w:r>
         <w:r>
-          <w:t>13</w:t>
+          <w:t>14</w:t>
         </w:r>
         <w:r>
           <w:fldChar w:fldCharType="end"/>
@@ -870,9 +870,37 @@
     </w:p>
     <w:p>
       <w:pPr>
+        <w:pStyle w:val="TOC2"/>
+      </w:pPr>
+      <w:hyperlink w:anchor="_Toc000020" w:history="1">
+        <w:r>
+          <w:t xml:space="preserve">4.3 Struktur Organisasi Kantor Cabang</w:t>
+        </w:r>
+        <w:r>
+          <w:tab/>
+        </w:r>
+        <w:r>
+          <w:fldChar w:fldCharType="begin"/>
+        </w:r>
+        <w:r>
+          <w:instrText xml:space="preserve"> PAGEREF _Toc000020 \h </w:instrText>
+        </w:r>
+        <w:r>
+          <w:fldChar w:fldCharType="separate"/>
+        </w:r>
+        <w:r>
+          <w:t>14</w:t>
+        </w:r>
+        <w:r>
+          <w:fldChar w:fldCharType="end"/>
+        </w:r>
+      </w:hyperlink>
+    </w:p>
+    <w:p>
+      <w:pPr>
         <w:pStyle w:val="TOC1"/>
       </w:pPr>
-      <w:hyperlink w:anchor="_Toc000020" w:history="1">
+      <w:hyperlink w:anchor="_Toc000021" w:history="1">
         <w:r>
           <w:t xml:space="preserve">BAB V LAYANAN DAMRI</w:t>
         </w:r>
@@ -883,13 +911,13 @@
           <w:fldChar w:fldCharType="begin"/>
         </w:r>
         <w:r>
-          <w:instrText xml:space="preserve"> PAGEREF _Toc000020 \h </w:instrText>
+          <w:instrText xml:space="preserve"> PAGEREF _Toc000021 \h </w:instrText>
         </w:r>
         <w:r>
           <w:fldChar w:fldCharType="separate"/>
         </w:r>
         <w:r>
-          <w:t>14</w:t>
+          <w:t>16</w:t>
         </w:r>
         <w:r>
           <w:fldChar w:fldCharType="end"/>
@@ -900,7 +928,7 @@
       <w:pPr>
         <w:pStyle w:val="TOC2"/>
       </w:pPr>
-      <w:hyperlink w:anchor="_Toc000021" w:history="1">
+      <w:hyperlink w:anchor="_Toc000022" w:history="1">
         <w:r>
           <w:t xml:space="preserve">5.1 Tujuh Segmen Layanan</w:t>
         </w:r>
@@ -911,13 +939,13 @@
           <w:fldChar w:fldCharType="begin"/>
         </w:r>
         <w:r>
-          <w:instrText xml:space="preserve"> PAGEREF _Toc000021 \h </w:instrText>
+          <w:instrText xml:space="preserve"> PAGEREF _Toc000022 \h </w:instrText>
         </w:r>
         <w:r>
           <w:fldChar w:fldCharType="separate"/>
         </w:r>
         <w:r>
-          <w:t>14</w:t>
+          <w:t>16</w:t>
         </w:r>
         <w:r>
           <w:fldChar w:fldCharType="end"/>
@@ -928,7 +956,7 @@
       <w:pPr>
         <w:pStyle w:val="TOC2"/>
       </w:pPr>
-      <w:hyperlink w:anchor="_Toc000022" w:history="1">
+      <w:hyperlink w:anchor="_Toc000023" w:history="1">
         <w:r>
           <w:t xml:space="preserve">5.2 Angkutan Bandara</w:t>
         </w:r>
@@ -939,13 +967,13 @@
           <w:fldChar w:fldCharType="begin"/>
         </w:r>
         <w:r>
-          <w:instrText xml:space="preserve"> PAGEREF _Toc000022 \h </w:instrText>
+          <w:instrText xml:space="preserve"> PAGEREF _Toc000023 \h </w:instrText>
         </w:r>
         <w:r>
           <w:fldChar w:fldCharType="separate"/>
         </w:r>
         <w:r>
-          <w:t>15</w:t>
+          <w:t>17</w:t>
         </w:r>
         <w:r>
           <w:fldChar w:fldCharType="end"/>
@@ -956,7 +984,7 @@
       <w:pPr>
         <w:pStyle w:val="TOC2"/>
       </w:pPr>
-      <w:hyperlink w:anchor="_Toc000023" w:history="1">
+      <w:hyperlink w:anchor="_Toc000024" w:history="1">
         <w:r>
           <w:t xml:space="preserve">5.3 Angkutan Antarkota</w:t>
         </w:r>
@@ -967,13 +995,13 @@
           <w:fldChar w:fldCharType="begin"/>
         </w:r>
         <w:r>
-          <w:instrText xml:space="preserve"> PAGEREF _Toc000023 \h </w:instrText>
+          <w:instrText xml:space="preserve"> PAGEREF _Toc000024 \h </w:instrText>
         </w:r>
         <w:r>
           <w:fldChar w:fldCharType="separate"/>
         </w:r>
         <w:r>
-          <w:t>15</w:t>
+          <w:t>17</w:t>
         </w:r>
         <w:r>
           <w:fldChar w:fldCharType="end"/>
@@ -984,7 +1012,7 @@
       <w:pPr>
         <w:pStyle w:val="TOC2"/>
       </w:pPr>
-      <w:hyperlink w:anchor="_Toc000024" w:history="1">
+      <w:hyperlink w:anchor="_Toc000025" w:history="1">
         <w:r>
           <w:t xml:space="preserve">5.4 Angkutan Perkotaan</w:t>
         </w:r>
@@ -995,13 +1023,13 @@
           <w:fldChar w:fldCharType="begin"/>
         </w:r>
         <w:r>
-          <w:instrText xml:space="preserve"> PAGEREF _Toc000024 \h </w:instrText>
+          <w:instrText xml:space="preserve"> PAGEREF _Toc000025 \h </w:instrText>
         </w:r>
         <w:r>
           <w:fldChar w:fldCharType="separate"/>
         </w:r>
         <w:r>
-          <w:t>16</w:t>
+          <w:t>18</w:t>
         </w:r>
         <w:r>
           <w:fldChar w:fldCharType="end"/>
@@ -1012,7 +1040,7 @@
       <w:pPr>
         <w:pStyle w:val="TOC2"/>
       </w:pPr>
-      <w:hyperlink w:anchor="_Toc000025" w:history="1">
+      <w:hyperlink w:anchor="_Toc000026" w:history="1">
         <w:r>
           <w:t xml:space="preserve">5.5 Angkutan Perintis</w:t>
         </w:r>
@@ -1023,13 +1051,13 @@
           <w:fldChar w:fldCharType="begin"/>
         </w:r>
         <w:r>
-          <w:instrText xml:space="preserve"> PAGEREF _Toc000025 \h </w:instrText>
+          <w:instrText xml:space="preserve"> PAGEREF _Toc000026 \h </w:instrText>
         </w:r>
         <w:r>
           <w:fldChar w:fldCharType="separate"/>
         </w:r>
         <w:r>
-          <w:t>16</w:t>
+          <w:t>18</w:t>
         </w:r>
         <w:r>
           <w:fldChar w:fldCharType="end"/>
@@ -1040,7 +1068,7 @@
       <w:pPr>
         <w:pStyle w:val="TOC2"/>
       </w:pPr>
-      <w:hyperlink w:anchor="_Toc000026" w:history="1">
+      <w:hyperlink w:anchor="_Toc000027" w:history="1">
         <w:r>
           <w:t xml:space="preserve">5.6 Angkutan Lintas Batas Negara</w:t>
         </w:r>
@@ -1051,13 +1079,13 @@
           <w:fldChar w:fldCharType="begin"/>
         </w:r>
         <w:r>
-          <w:instrText xml:space="preserve"> PAGEREF _Toc000026 \h </w:instrText>
+          <w:instrText xml:space="preserve"> PAGEREF _Toc000027 \h </w:instrText>
         </w:r>
         <w:r>
           <w:fldChar w:fldCharType="separate"/>
         </w:r>
         <w:r>
-          <w:t>17</w:t>
+          <w:t>19</w:t>
         </w:r>
         <w:r>
           <w:fldChar w:fldCharType="end"/>
@@ -1068,7 +1096,7 @@
       <w:pPr>
         <w:pStyle w:val="TOC2"/>
       </w:pPr>
-      <w:hyperlink w:anchor="_Toc000027" w:history="1">
+      <w:hyperlink w:anchor="_Toc000028" w:history="1">
         <w:r>
           <w:t xml:space="preserve">5.7 Pariwisata dan Logistik</w:t>
         </w:r>
@@ -1079,13 +1107,13 @@
           <w:fldChar w:fldCharType="begin"/>
         </w:r>
         <w:r>
-          <w:instrText xml:space="preserve"> PAGEREF _Toc000027 \h </w:instrText>
+          <w:instrText xml:space="preserve"> PAGEREF _Toc000028 \h </w:instrText>
         </w:r>
         <w:r>
           <w:fldChar w:fldCharType="separate"/>
         </w:r>
         <w:r>
-          <w:t>17</w:t>
+          <w:t>19</w:t>
         </w:r>
         <w:r>
           <w:fldChar w:fldCharType="end"/>
@@ -1096,7 +1124,7 @@
       <w:pPr>
         <w:pStyle w:val="TOC1"/>
       </w:pPr>
-      <w:hyperlink w:anchor="_Toc000028" w:history="1">
+      <w:hyperlink w:anchor="_Toc000029" w:history="1">
         <w:r>
           <w:t xml:space="preserve">BAB VI DAMRI CABANG BANDAR LAMPUNG</w:t>
         </w:r>
@@ -1107,13 +1135,13 @@
           <w:fldChar w:fldCharType="begin"/>
         </w:r>
         <w:r>
-          <w:instrText xml:space="preserve"> PAGEREF _Toc000028 \h </w:instrText>
+          <w:instrText xml:space="preserve"> PAGEREF _Toc000029 \h </w:instrText>
         </w:r>
         <w:r>
           <w:fldChar w:fldCharType="separate"/>
         </w:r>
         <w:r>
-          <w:t>19</w:t>
+          <w:t>21</w:t>
         </w:r>
         <w:r>
           <w:fldChar w:fldCharType="end"/>
@@ -1124,7 +1152,7 @@
       <w:pPr>
         <w:pStyle w:val="TOC2"/>
       </w:pPr>
-      <w:hyperlink w:anchor="_Toc000029" w:history="1">
+      <w:hyperlink w:anchor="_Toc000030" w:history="1">
         <w:r>
           <w:t xml:space="preserve">6.1 Profil Cabang</w:t>
         </w:r>
@@ -1135,13 +1163,13 @@
           <w:fldChar w:fldCharType="begin"/>
         </w:r>
         <w:r>
-          <w:instrText xml:space="preserve"> PAGEREF _Toc000029 \h </w:instrText>
+          <w:instrText xml:space="preserve"> PAGEREF _Toc000030 \h </w:instrText>
         </w:r>
         <w:r>
           <w:fldChar w:fldCharType="separate"/>
         </w:r>
         <w:r>
-          <w:t>19</w:t>
+          <w:t>21</w:t>
         </w:r>
         <w:r>
           <w:fldChar w:fldCharType="end"/>
@@ -1152,7 +1180,7 @@
       <w:pPr>
         <w:pStyle w:val="TOC2"/>
       </w:pPr>
-      <w:hyperlink w:anchor="_Toc000030" w:history="1">
+      <w:hyperlink w:anchor="_Toc000031" w:history="1">
         <w:r>
           <w:t xml:space="preserve">6.2 Trayek dan Layanan di Lampung</w:t>
         </w:r>
@@ -1163,13 +1191,13 @@
           <w:fldChar w:fldCharType="begin"/>
         </w:r>
         <w:r>
-          <w:instrText xml:space="preserve"> PAGEREF _Toc000030 \h </w:instrText>
+          <w:instrText xml:space="preserve"> PAGEREF _Toc000031 \h </w:instrText>
         </w:r>
         <w:r>
           <w:fldChar w:fldCharType="separate"/>
         </w:r>
         <w:r>
-          <w:t>20</w:t>
+          <w:t>22</w:t>
         </w:r>
         <w:r>
           <w:fldChar w:fldCharType="end"/>
@@ -1180,7 +1208,7 @@
       <w:pPr>
         <w:pStyle w:val="TOC2"/>
       </w:pPr>
-      <w:hyperlink w:anchor="_Toc000031" w:history="1">
+      <w:hyperlink w:anchor="_Toc000032" w:history="1">
         <w:r>
           <w:t xml:space="preserve">6.3 Sarana dan Fasilitas</w:t>
         </w:r>
@@ -1191,13 +1219,13 @@
           <w:fldChar w:fldCharType="begin"/>
         </w:r>
         <w:r>
-          <w:instrText xml:space="preserve"> PAGEREF _Toc000031 \h </w:instrText>
+          <w:instrText xml:space="preserve"> PAGEREF _Toc000032 \h </w:instrText>
         </w:r>
         <w:r>
           <w:fldChar w:fldCharType="separate"/>
         </w:r>
         <w:r>
-          <w:t>21</w:t>
+          <w:t>23</w:t>
         </w:r>
         <w:r>
           <w:fldChar w:fldCharType="end"/>
@@ -1208,7 +1236,7 @@
       <w:pPr>
         <w:pStyle w:val="TOC1"/>
       </w:pPr>
-      <w:hyperlink w:anchor="_Toc000032" w:history="1">
+      <w:hyperlink w:anchor="_Toc000033" w:history="1">
         <w:r>
           <w:t xml:space="preserve">BAB VII KESELAMATAN DAN PELAYANAN</w:t>
         </w:r>
@@ -1219,13 +1247,13 @@
           <w:fldChar w:fldCharType="begin"/>
         </w:r>
         <w:r>
-          <w:instrText xml:space="preserve"> PAGEREF _Toc000032 \h </w:instrText>
+          <w:instrText xml:space="preserve"> PAGEREF _Toc000033 \h </w:instrText>
         </w:r>
         <w:r>
           <w:fldChar w:fldCharType="separate"/>
         </w:r>
         <w:r>
-          <w:t>23</w:t>
+          <w:t>25</w:t>
         </w:r>
         <w:r>
           <w:fldChar w:fldCharType="end"/>
@@ -1236,7 +1264,7 @@
       <w:pPr>
         <w:pStyle w:val="TOC2"/>
       </w:pPr>
-      <w:hyperlink w:anchor="_Toc000033" w:history="1">
+      <w:hyperlink w:anchor="_Toc000034" w:history="1">
         <w:r>
           <w:t xml:space="preserve">7.1 Budaya Keselamatan</w:t>
         </w:r>
@@ -1247,13 +1275,13 @@
           <w:fldChar w:fldCharType="begin"/>
         </w:r>
         <w:r>
-          <w:instrText xml:space="preserve"> PAGEREF _Toc000033 \h </w:instrText>
+          <w:instrText xml:space="preserve"> PAGEREF _Toc000034 \h </w:instrText>
         </w:r>
         <w:r>
           <w:fldChar w:fldCharType="separate"/>
         </w:r>
         <w:r>
-          <w:t>23</w:t>
+          <w:t>25</w:t>
         </w:r>
         <w:r>
           <w:fldChar w:fldCharType="end"/>
@@ -1264,7 +1292,7 @@
       <w:pPr>
         <w:pStyle w:val="TOC2"/>
       </w:pPr>
-      <w:hyperlink w:anchor="_Toc000034" w:history="1">
+      <w:hyperlink w:anchor="_Toc000035" w:history="1">
         <w:r>
           <w:t xml:space="preserve">7.2 Standar Pelayanan Minimal</w:t>
         </w:r>
@@ -1275,13 +1303,13 @@
           <w:fldChar w:fldCharType="begin"/>
         </w:r>
         <w:r>
-          <w:instrText xml:space="preserve"> PAGEREF _Toc000034 \h </w:instrText>
+          <w:instrText xml:space="preserve"> PAGEREF _Toc000035 \h </w:instrText>
         </w:r>
         <w:r>
           <w:fldChar w:fldCharType="separate"/>
         </w:r>
         <w:r>
-          <w:t>25</w:t>
+          <w:t>27</w:t>
         </w:r>
         <w:r>
           <w:fldChar w:fldCharType="end"/>
@@ -1292,7 +1320,7 @@
       <w:pPr>
         <w:pStyle w:val="TOC2"/>
       </w:pPr>
-      <w:hyperlink w:anchor="_Toc000035" w:history="1">
+      <w:hyperlink w:anchor="_Toc000036" w:history="1">
         <w:r>
           <w:t xml:space="preserve">7.3 Pemesanan Tiket dan Pengaduan</w:t>
         </w:r>
@@ -1303,13 +1331,13 @@
           <w:fldChar w:fldCharType="begin"/>
         </w:r>
         <w:r>
-          <w:instrText xml:space="preserve"> PAGEREF _Toc000035 \h </w:instrText>
+          <w:instrText xml:space="preserve"> PAGEREF _Toc000036 \h </w:instrText>
         </w:r>
         <w:r>
           <w:fldChar w:fldCharType="separate"/>
         </w:r>
         <w:r>
-          <w:t>25</w:t>
+          <w:t>27</w:t>
         </w:r>
         <w:r>
           <w:fldChar w:fldCharType="end"/>
@@ -1320,7 +1348,7 @@
       <w:pPr>
         <w:pStyle w:val="TOC1"/>
       </w:pPr>
-      <w:hyperlink w:anchor="_Toc000036" w:history="1">
+      <w:hyperlink w:anchor="_Toc000037" w:history="1">
         <w:r>
           <w:t xml:space="preserve">BAB VIII INSAN DAMRI</w:t>
         </w:r>
@@ -1331,13 +1359,13 @@
           <w:fldChar w:fldCharType="begin"/>
         </w:r>
         <w:r>
-          <w:instrText xml:space="preserve"> PAGEREF _Toc000036 \h </w:instrText>
+          <w:instrText xml:space="preserve"> PAGEREF _Toc000037 \h </w:instrText>
         </w:r>
         <w:r>
           <w:fldChar w:fldCharType="separate"/>
         </w:r>
         <w:r>
-          <w:t>27</w:t>
+          <w:t>29</w:t>
         </w:r>
         <w:r>
           <w:fldChar w:fldCharType="end"/>
@@ -1348,7 +1376,7 @@
       <w:pPr>
         <w:pStyle w:val="TOC2"/>
       </w:pPr>
-      <w:hyperlink w:anchor="_Toc000037" w:history="1">
+      <w:hyperlink w:anchor="_Toc000038" w:history="1">
         <w:r>
           <w:t xml:space="preserve">8.1 Pengembangan Kompetensi</w:t>
         </w:r>
@@ -1359,13 +1387,13 @@
           <w:fldChar w:fldCharType="begin"/>
         </w:r>
         <w:r>
-          <w:instrText xml:space="preserve"> PAGEREF _Toc000037 \h </w:instrText>
+          <w:instrText xml:space="preserve"> PAGEREF _Toc000038 \h </w:instrText>
         </w:r>
         <w:r>
           <w:fldChar w:fldCharType="separate"/>
         </w:r>
         <w:r>
-          <w:t>27</w:t>
+          <w:t>29</w:t>
         </w:r>
         <w:r>
           <w:fldChar w:fldCharType="end"/>
@@ -1376,7 +1404,7 @@
       <w:pPr>
         <w:pStyle w:val="TOC2"/>
       </w:pPr>
-      <w:hyperlink w:anchor="_Toc000038" w:history="1">
+      <w:hyperlink w:anchor="_Toc000039" w:history="1">
         <w:r>
           <w:t xml:space="preserve">8.2 Hak dan Kewajiban Karyawan</w:t>
         </w:r>
@@ -1387,13 +1415,13 @@
           <w:fldChar w:fldCharType="begin"/>
         </w:r>
         <w:r>
-          <w:instrText xml:space="preserve"> PAGEREF _Toc000038 \h </w:instrText>
+          <w:instrText xml:space="preserve"> PAGEREF _Toc000039 \h </w:instrText>
         </w:r>
         <w:r>
           <w:fldChar w:fldCharType="separate"/>
         </w:r>
         <w:r>
-          <w:t>28</w:t>
+          <w:t>30</w:t>
         </w:r>
         <w:r>
           <w:fldChar w:fldCharType="end"/>
@@ -1404,7 +1432,7 @@
       <w:pPr>
         <w:pStyle w:val="TOC2"/>
       </w:pPr>
-      <w:hyperlink w:anchor="_Toc000039" w:history="1">
+      <w:hyperlink w:anchor="_Toc000040" w:history="1">
         <w:r>
           <w:t xml:space="preserve">8.3 Menjadi Duta DAMRI</w:t>
         </w:r>
@@ -1415,13 +1443,13 @@
           <w:fldChar w:fldCharType="begin"/>
         </w:r>
         <w:r>
-          <w:instrText xml:space="preserve"> PAGEREF _Toc000039 \h </w:instrText>
+          <w:instrText xml:space="preserve"> PAGEREF _Toc000040 \h </w:instrText>
         </w:r>
         <w:r>
           <w:fldChar w:fldCharType="separate"/>
         </w:r>
         <w:r>
-          <w:t>29</w:t>
+          <w:t>31</w:t>
         </w:r>
         <w:r>
           <w:fldChar w:fldCharType="end"/>
@@ -1432,7 +1460,7 @@
       <w:pPr>
         <w:pStyle w:val="TOC1"/>
       </w:pPr>
-      <w:hyperlink w:anchor="_Toc000040" w:history="1">
+      <w:hyperlink w:anchor="_Toc000041" w:history="1">
         <w:r>
           <w:t xml:space="preserve">PENUTUP</w:t>
         </w:r>
@@ -1443,13 +1471,13 @@
           <w:fldChar w:fldCharType="begin"/>
         </w:r>
         <w:r>
-          <w:instrText xml:space="preserve"> PAGEREF _Toc000040 \h </w:instrText>
+          <w:instrText xml:space="preserve"> PAGEREF _Toc000041 \h </w:instrText>
         </w:r>
         <w:r>
           <w:fldChar w:fldCharType="separate"/>
         </w:r>
         <w:r>
-          <w:t>30</w:t>
+          <w:t>32</w:t>
         </w:r>
         <w:r>
           <w:fldChar w:fldCharType="end"/>
@@ -1460,7 +1488,7 @@
       <w:pPr>
         <w:pStyle w:val="TOC1"/>
       </w:pPr>
-      <w:hyperlink w:anchor="_Toc000041" w:history="1">
+      <w:hyperlink w:anchor="_Toc000042" w:history="1">
         <w:r>
           <w:t xml:space="preserve">DAFTAR PUSTAKA</w:t>
         </w:r>
@@ -1471,13 +1499,13 @@
           <w:fldChar w:fldCharType="begin"/>
         </w:r>
         <w:r>
-          <w:instrText xml:space="preserve"> PAGEREF _Toc000041 \h </w:instrText>
+          <w:instrText xml:space="preserve"> PAGEREF _Toc000042 \h </w:instrText>
         </w:r>
         <w:r>
           <w:fldChar w:fldCharType="separate"/>
         </w:r>
         <w:r>
-          <w:t>31</w:t>
+          <w:t>33</w:t>
         </w:r>
         <w:r>
           <w:fldChar w:fldCharType="end"/>
@@ -4608,7 +4636,7 @@
       </w:pPr>
       <w:bookmarkStart w:name="_Toc000018" w:id="18"/>
       <w:r>
-        <w:t xml:space="preserve">4.1 Struktur Organisasi</w:t>
+        <w:t xml:space="preserve">4.1 Struktur Organisasi Kantor Pusat</w:t>
       </w:r>
       <w:bookmarkEnd w:id="18"/>
     </w:p>
@@ -4647,7 +4675,70 @@
         <w:t xml:space="preserve">Direksi</w:t>
       </w:r>
       <w:r>
-        <w:t xml:space="preserve">. Dewan Pengawas bertugas mengawasi dan memberi nasihat kepada Direksi, sedangkan Direksi bertanggung jawab atas pengurusan perusahaan sehari-hari.</w:t>
+        <w:t xml:space="preserve">. Dewan Pengawas bertugas mengawasi dan memberi nasihat kepada Direksi, dengan dukungan Komite Audit dan Sekretaris Dewan Pengawas. Direksi bertanggung jawab atas pengurusan perusahaan sehari-hari.</w:t>
+      </w:r>
+    </w:p>
+    <w:p>
+      <w:pPr>
+        <w:keepNext/>
+        <w:spacing w:after="60" w:before="120" w:line="240" w:lineRule="auto"/>
+        <w:jc w:val="center"/>
+      </w:pPr>
+      <w:r>
+        <w:drawing>
+          <wp:inline distT="0" distB="0" distL="0" distR="0">
+            <wp:extent cx="3888106" cy="1771248"/>
+            <wp:effectExtent t="0" r="0" b="0" l="0"/>
+            <wp:docPr id="1" name="Gambar 4.1 Struktur organisasi kantor pusat Perum DAMRI tingkat Direksi" descr="Gambar 4.1 Struktur organisasi kantor pusat Perum DAMRI tingkat Direksi" title="Gambar 4.1 Struktur organisasi kantor pusat Perum DAMRI tingkat Direksi"/>
+            <wp:cNvGraphicFramePr>
+              <a:graphicFrameLocks xmlns:a="http://schemas.openxmlformats.org/drawingml/2006/main" noChangeAspect="1"/>
+            </wp:cNvGraphicFramePr>
+            <a:graphic xmlns:a="http://schemas.openxmlformats.org/drawingml/2006/main">
+              <a:graphicData uri="http://schemas.openxmlformats.org/drawingml/2006/picture">
+                <pic:pic xmlns:pic="http://schemas.openxmlformats.org/drawingml/2006/picture">
+                  <pic:nvPicPr>
+                    <pic:cNvPr id="0" name="" descr=""/>
+                    <pic:cNvPicPr>
+                      <a:picLocks noChangeAspect="1" noChangeArrowheads="1"/>
+                    </pic:cNvPicPr>
+                  </pic:nvPicPr>
+                  <pic:blipFill>
+                    <a:blip r:embed="rId11" cstate="none"/>
+                    <a:srcRect/>
+                    <a:stretch>
+                      <a:fillRect/>
+                    </a:stretch>
+                  </pic:blipFill>
+                  <pic:spPr bwMode="auto">
+                    <a:xfrm>
+                      <a:off x="0" y="0"/>
+                      <a:ext cx="3888106" cy="1771248"/>
+                    </a:xfrm>
+                    <a:prstGeom prst="rect">
+                      <a:avLst/>
+                    </a:prstGeom>
+                  </pic:spPr>
+                </pic:pic>
+              </a:graphicData>
+            </a:graphic>
+          </wp:inline>
+        </w:drawing>
+      </w:r>
+    </w:p>
+    <w:p>
+      <w:pPr>
+        <w:spacing w:after="200"/>
+        <w:jc w:val="center"/>
+      </w:pPr>
+      <w:r>
+        <w:rPr>
+          <w:i/>
+          <w:iCs/>
+          <w:color w:val="6B7280"/>
+          <w:sz w:val="18"/>
+          <w:szCs w:val="18"/>
+        </w:rPr>
+        <w:t xml:space="preserve">Gambar 4.1 Struktur organisasi kantor pusat Perum DAMRI tingkat Direksi</w:t>
       </w:r>
     </w:p>
     <w:p>
@@ -5025,10 +5116,108 @@
     </w:p>
     <w:p>
       <w:pPr>
+        <w:keepNext/>
+      </w:pPr>
+      <w:r>
+        <w:t xml:space="preserve">Di bawah Direksi terdapat unit-unit kerja setingkat divisi. Pimpinannya kini disebut </w:t>
+      </w:r>
+      <w:r>
+        <w:rPr>
+          <w:i/>
+          <w:iCs/>
+        </w:rPr>
+        <w:t xml:space="preserve">Vice President</w:t>
+      </w:r>
+      <w:r>
+        <w:t xml:space="preserve"> (VP), sebelumnya Kepala Divisi. Unit-unit tersebut antara lain:</w:t>
+      </w:r>
+    </w:p>
+    <w:p>
+      <w:pPr>
+        <w:pStyle w:val="ListParagraph"/>
+        <w:numPr>
+          <w:ilvl w:val="0"/>
+          <w:numId w:val="2"/>
+        </w:numPr>
+        <w:spacing w:after="60"/>
+      </w:pPr>
+      <w:r>
+        <w:t xml:space="preserve">Sekretariat Perusahaan (</w:t>
+      </w:r>
+      <w:r>
+        <w:rPr>
+          <w:i/>
+          <w:iCs/>
+        </w:rPr>
+        <w:t xml:space="preserve">Corporate Secretary</w:t>
+      </w:r>
+      <w:r>
+        <w:t xml:space="preserve">) dan Satuan Pengawas Internal, yang berada langsung di bawah Direktur Utama.</w:t>
+      </w:r>
+    </w:p>
+    <w:p>
+      <w:pPr>
+        <w:pStyle w:val="ListParagraph"/>
+        <w:numPr>
+          <w:ilvl w:val="0"/>
+          <w:numId w:val="2"/>
+        </w:numPr>
+        <w:spacing w:after="60"/>
+      </w:pPr>
+      <w:r>
+        <w:t xml:space="preserve">Komersial dan Pemasaran, Pengembangan Bisnis, serta Strategi Korporasi.</w:t>
+      </w:r>
+    </w:p>
+    <w:p>
+      <w:pPr>
+        <w:pStyle w:val="ListParagraph"/>
+        <w:numPr>
+          <w:ilvl w:val="0"/>
+          <w:numId w:val="2"/>
+        </w:numPr>
+        <w:spacing w:after="60"/>
+      </w:pPr>
+      <w:r>
+        <w:t xml:space="preserve">Operasional dan Keselamatan, Kualitas dan Fasilitas Pelayanan, serta Pengadaan.</w:t>
+      </w:r>
+    </w:p>
+    <w:p>
+      <w:pPr>
+        <w:pStyle w:val="ListParagraph"/>
+        <w:numPr>
+          <w:ilvl w:val="0"/>
+          <w:numId w:val="2"/>
+        </w:numPr>
+        <w:spacing w:after="140"/>
+      </w:pPr>
+      <w:r>
+        <w:t xml:space="preserve">Human Capital, </w:t>
+      </w:r>
+      <w:r>
+        <w:rPr>
+          <w:i/>
+          <w:iCs/>
+        </w:rPr>
+        <w:t xml:space="preserve">General Service</w:t>
+      </w:r>
+      <w:r>
+        <w:t xml:space="preserve">, dan Teknologi Informasi.</w:t>
+      </w:r>
+    </w:p>
+    <w:p>
+      <w:pPr>
         <w:keepNext w:val="false"/>
       </w:pPr>
       <w:r>
-        <w:t xml:space="preserve">Direksi didukung oleh unit-unit di kantor pusat, antara lain Sekretariat Perusahaan dan Satuan Pengawas Internal.</w:t>
+        <w:t xml:space="preserve">Susunan dan nama unit kerja ditetapkan melalui keputusan Direksi. Perubahan nomenklatur struktur organisasi yang terakhir ditetapkan pada 1 November 2023.</w:t>
+      </w:r>
+    </w:p>
+    <w:p>
+      <w:pPr>
+        <w:pStyle w:val="Panduan"/>
+      </w:pPr>
+      <w:r>
+        <w:t xml:space="preserve">Sesuaikan daftar unit dan pembagiannya per direktorat dengan keputusan Direksi tentang struktur organisasi yang berlaku.</w:t>
       </w:r>
     </w:p>
     <w:p>
@@ -5046,7 +5235,7 @@
         <w:keepNext w:val="false"/>
       </w:pPr>
       <w:r>
-        <w:t xml:space="preserve">Untuk menjangkau seluruh wilayah Indonesia, DAMRI memiliki </w:t>
+        <w:t xml:space="preserve">Untuk menjangkau seluruh wilayah Indonesia, DAMRI membentuk kantor Divisi Regional dan kantor cabang. Menurut profil perusahaan, DAMRI memiliki </w:t>
       </w:r>
       <w:r>
         <w:rPr>
@@ -5066,7 +5255,7 @@
         <w:t xml:space="preserve">44 kantor cabang</w:t>
       </w:r>
       <w:r>
-        <w:t xml:space="preserve">. Divisi Regional mengoordinasikan cabang-cabang di wilayahnya, sedangkan setiap cabang dipimpin oleh seorang General Manager yang bertanggung jawab atas operasional layanan di daerahnya.</w:t>
+        <w:t xml:space="preserve">. Divisi Regional mengoordinasikan cabang-cabang di wilayahnya, sedangkan setiap cabang dipimpin oleh seorang General Manager yang bertanggung jawab atas layanan di daerahnya.</w:t>
       </w:r>
     </w:p>
     <w:p>
@@ -5154,10 +5343,531 @@
     </w:p>
     <w:p>
       <w:pPr>
+        <w:pStyle w:val="Heading2"/>
+      </w:pPr>
+      <w:bookmarkStart w:name="_Toc000020" w:id="20"/>
+      <w:r>
+        <w:t xml:space="preserve">4.3 Struktur Organisasi Kantor Cabang</w:t>
+      </w:r>
+      <w:bookmarkEnd w:id="20"/>
+    </w:p>
+    <w:p>
+      <w:pPr>
+        <w:keepNext w:val="false"/>
+      </w:pPr>
+      <w:r>
+        <w:t xml:space="preserve">Kantor cabang dipimpin oleh seorang </w:t>
+      </w:r>
+      <w:r>
+        <w:rPr>
+          <w:b/>
+          <w:bCs/>
+        </w:rPr>
+        <w:t xml:space="preserve">General Manager (GM)</w:t>
+      </w:r>
+      <w:r>
+        <w:t xml:space="preserve">. Dalam menjalankan tugasnya, GM dibantu tiga manager yang masing-masing membawahi asisten manager dan staf. Gambaran umumnya sebagai berikut.</w:t>
+      </w:r>
+    </w:p>
+    <w:p>
+      <w:pPr>
+        <w:keepNext/>
+        <w:spacing w:after="60" w:before="120" w:line="240" w:lineRule="auto"/>
+        <w:jc w:val="center"/>
+      </w:pPr>
+      <w:r>
+        <w:drawing>
+          <wp:inline distT="0" distB="0" distL="0" distR="0">
+            <wp:extent cx="3888106" cy="1699246"/>
+            <wp:effectExtent t="0" r="0" b="0" l="0"/>
+            <wp:docPr id="1" name="Gambar 4.2 Gambaran umum struktur organisasi kantor cabang DAMRI" descr="Gambar 4.2 Gambaran umum struktur organisasi kantor cabang DAMRI" title="Gambar 4.2 Gambaran umum struktur organisasi kantor cabang DAMRI"/>
+            <wp:cNvGraphicFramePr>
+              <a:graphicFrameLocks xmlns:a="http://schemas.openxmlformats.org/drawingml/2006/main" noChangeAspect="1"/>
+            </wp:cNvGraphicFramePr>
+            <a:graphic xmlns:a="http://schemas.openxmlformats.org/drawingml/2006/main">
+              <a:graphicData uri="http://schemas.openxmlformats.org/drawingml/2006/picture">
+                <pic:pic xmlns:pic="http://schemas.openxmlformats.org/drawingml/2006/picture">
+                  <pic:nvPicPr>
+                    <pic:cNvPr id="0" name="" descr=""/>
+                    <pic:cNvPicPr>
+                      <a:picLocks noChangeAspect="1" noChangeArrowheads="1"/>
+                    </pic:cNvPicPr>
+                  </pic:nvPicPr>
+                  <pic:blipFill>
+                    <a:blip r:embed="rId12" cstate="none"/>
+                    <a:srcRect/>
+                    <a:stretch>
+                      <a:fillRect/>
+                    </a:stretch>
+                  </pic:blipFill>
+                  <pic:spPr bwMode="auto">
+                    <a:xfrm>
+                      <a:off x="0" y="0"/>
+                      <a:ext cx="3888106" cy="1699246"/>
+                    </a:xfrm>
+                    <a:prstGeom prst="rect">
+                      <a:avLst/>
+                    </a:prstGeom>
+                  </pic:spPr>
+                </pic:pic>
+              </a:graphicData>
+            </a:graphic>
+          </wp:inline>
+        </w:drawing>
+      </w:r>
+    </w:p>
+    <w:p>
+      <w:pPr>
+        <w:spacing w:after="200"/>
+        <w:jc w:val="center"/>
+      </w:pPr>
+      <w:r>
+        <w:rPr>
+          <w:i/>
+          <w:iCs/>
+          <w:color w:val="6B7280"/>
+          <w:sz w:val="18"/>
+          <w:szCs w:val="18"/>
+        </w:rPr>
+        <w:t xml:space="preserve">Gambar 4.2 Gambaran umum struktur organisasi kantor cabang DAMRI</w:t>
+      </w:r>
+    </w:p>
+    <w:tbl>
+      <w:tblPr>
+        <w:tblW w:type="dxa" w:w="6123"/>
+        <w:tblBorders>
+          <w:top w:val="single" w:color="C9D3E3" w:sz="4"/>
+          <w:left w:val="none" w:color="FFFFFF" w:sz="0"/>
+          <w:bottom w:val="single" w:color="C9D3E3" w:sz="4"/>
+          <w:right w:val="none" w:color="FFFFFF" w:sz="0"/>
+          <w:insideH w:val="single" w:color="C9D3E3" w:sz="4"/>
+          <w:insideV w:val="none" w:color="FFFFFF" w:sz="0"/>
+        </w:tblBorders>
+      </w:tblPr>
+      <w:tblGrid>
+        <w:gridCol w:w="2313"/>
+        <w:gridCol w:w="3810"/>
+      </w:tblGrid>
+      <w:tr>
+        <w:trPr>
+          <w:cantSplit/>
+          <w:tblHeader/>
+        </w:trPr>
+        <w:tc>
+          <w:tcPr>
+            <w:tcW w:type="dxa" w:w="2313"/>
+            <w:shd w:fill="0B3A78" w:color="auto" w:val="clear"/>
+            <w:tcMar>
+              <w:top w:type="dxa" w:w="50"/>
+              <w:left w:type="dxa" w:w="90"/>
+              <w:bottom w:type="dxa" w:w="50"/>
+              <w:right w:type="dxa" w:w="90"/>
+            </w:tcMar>
+          </w:tcPr>
+          <w:p>
+            <w:pPr>
+              <w:keepNext/>
+              <w:spacing w:after="0" w:line="264" w:lineRule="auto"/>
+              <w:jc w:val="left"/>
+            </w:pPr>
+            <w:r>
+              <w:rPr>
+                <w:b/>
+                <w:bCs/>
+                <w:color w:val="FFFFFF"/>
+                <w:sz w:val="18"/>
+                <w:szCs w:val="18"/>
+              </w:rPr>
+              <w:t xml:space="preserve">Jabatan</w:t>
+            </w:r>
+          </w:p>
+        </w:tc>
+        <w:tc>
+          <w:tcPr>
+            <w:tcW w:type="dxa" w:w="3810"/>
+            <w:shd w:fill="0B3A78" w:color="auto" w:val="clear"/>
+            <w:tcMar>
+              <w:top w:type="dxa" w:w="50"/>
+              <w:left w:type="dxa" w:w="90"/>
+              <w:bottom w:type="dxa" w:w="50"/>
+              <w:right w:type="dxa" w:w="90"/>
+            </w:tcMar>
+          </w:tcPr>
+          <w:p>
+            <w:pPr>
+              <w:keepNext/>
+              <w:spacing w:after="0" w:line="264" w:lineRule="auto"/>
+              <w:jc w:val="left"/>
+            </w:pPr>
+            <w:r>
+              <w:rPr>
+                <w:b/>
+                <w:bCs/>
+                <w:color w:val="FFFFFF"/>
+                <w:sz w:val="18"/>
+                <w:szCs w:val="18"/>
+              </w:rPr>
+              <w:t xml:space="preserve">Tugas pokok</w:t>
+            </w:r>
+          </w:p>
+        </w:tc>
+      </w:tr>
+      <w:tr>
+        <w:trPr>
+          <w:cantSplit/>
+        </w:trPr>
+        <w:tc>
+          <w:tcPr>
+            <w:tcW w:type="dxa" w:w="2313"/>
+            <w:tcMar>
+              <w:top w:type="dxa" w:w="50"/>
+              <w:left w:type="dxa" w:w="90"/>
+              <w:bottom w:type="dxa" w:w="50"/>
+              <w:right w:type="dxa" w:w="90"/>
+            </w:tcMar>
+          </w:tcPr>
+          <w:p>
+            <w:pPr>
+              <w:keepNext w:val="false"/>
+              <w:spacing w:after="0" w:line="264" w:lineRule="auto"/>
+              <w:jc w:val="left"/>
+            </w:pPr>
+            <w:r>
+              <w:rPr>
+                <w:sz w:val="18"/>
+                <w:szCs w:val="18"/>
+              </w:rPr>
+              <w:t xml:space="preserve">General Manager</w:t>
+            </w:r>
+          </w:p>
+        </w:tc>
+        <w:tc>
+          <w:tcPr>
+            <w:tcW w:type="dxa" w:w="3810"/>
+            <w:tcMar>
+              <w:top w:type="dxa" w:w="50"/>
+              <w:left w:type="dxa" w:w="90"/>
+              <w:bottom w:type="dxa" w:w="50"/>
+              <w:right w:type="dxa" w:w="90"/>
+            </w:tcMar>
+          </w:tcPr>
+          <w:p>
+            <w:pPr>
+              <w:keepNext w:val="false"/>
+              <w:spacing w:after="0" w:line="264" w:lineRule="auto"/>
+              <w:jc w:val="left"/>
+            </w:pPr>
+            <w:r>
+              <w:rPr>
+                <w:sz w:val="18"/>
+                <w:szCs w:val="18"/>
+              </w:rPr>
+              <w:t xml:space="preserve">Memimpin cabang dan bertanggung jawab atas seluruh kegiatan usaha, operasional, dan kinerja cabang.</w:t>
+            </w:r>
+          </w:p>
+        </w:tc>
+      </w:tr>
+      <w:tr>
+        <w:trPr>
+          <w:cantSplit/>
+        </w:trPr>
+        <w:tc>
+          <w:tcPr>
+            <w:tcW w:type="dxa" w:w="2313"/>
+            <w:shd w:fill="F4F7FB" w:color="auto" w:val="clear"/>
+            <w:tcMar>
+              <w:top w:type="dxa" w:w="50"/>
+              <w:left w:type="dxa" w:w="90"/>
+              <w:bottom w:type="dxa" w:w="50"/>
+              <w:right w:type="dxa" w:w="90"/>
+            </w:tcMar>
+          </w:tcPr>
+          <w:p>
+            <w:pPr>
+              <w:keepNext w:val="false"/>
+              <w:spacing w:after="0" w:line="264" w:lineRule="auto"/>
+              <w:jc w:val="left"/>
+            </w:pPr>
+            <w:r>
+              <w:rPr>
+                <w:sz w:val="18"/>
+                <w:szCs w:val="18"/>
+              </w:rPr>
+              <w:t xml:space="preserve">Manager Usaha</w:t>
+            </w:r>
+          </w:p>
+        </w:tc>
+        <w:tc>
+          <w:tcPr>
+            <w:tcW w:type="dxa" w:w="3810"/>
+            <w:shd w:fill="F4F7FB" w:color="auto" w:val="clear"/>
+            <w:tcMar>
+              <w:top w:type="dxa" w:w="50"/>
+              <w:left w:type="dxa" w:w="90"/>
+              <w:bottom w:type="dxa" w:w="50"/>
+              <w:right w:type="dxa" w:w="90"/>
+            </w:tcMar>
+          </w:tcPr>
+          <w:p>
+            <w:pPr>
+              <w:keepNext w:val="false"/>
+              <w:spacing w:after="0" w:line="264" w:lineRule="auto"/>
+              <w:jc w:val="left"/>
+            </w:pPr>
+            <w:r>
+              <w:rPr>
+                <w:sz w:val="18"/>
+                <w:szCs w:val="18"/>
+              </w:rPr>
+              <w:t xml:space="preserve">Pemasaran, pengembangan usaha, penyelenggaraan layanan angkutan, serta keselamatan dan mutu pelayanan.</w:t>
+            </w:r>
+          </w:p>
+        </w:tc>
+      </w:tr>
+      <w:tr>
+        <w:trPr>
+          <w:cantSplit/>
+        </w:trPr>
+        <w:tc>
+          <w:tcPr>
+            <w:tcW w:type="dxa" w:w="2313"/>
+            <w:tcMar>
+              <w:top w:type="dxa" w:w="50"/>
+              <w:left w:type="dxa" w:w="90"/>
+              <w:bottom w:type="dxa" w:w="50"/>
+              <w:right w:type="dxa" w:w="90"/>
+            </w:tcMar>
+          </w:tcPr>
+          <w:p>
+            <w:pPr>
+              <w:keepNext w:val="false"/>
+              <w:spacing w:after="0" w:line="264" w:lineRule="auto"/>
+              <w:jc w:val="left"/>
+            </w:pPr>
+            <w:r>
+              <w:rPr>
+                <w:sz w:val="18"/>
+                <w:szCs w:val="18"/>
+              </w:rPr>
+              <w:t xml:space="preserve">Manager Keuangan, SDM dan Umum</w:t>
+            </w:r>
+          </w:p>
+        </w:tc>
+        <w:tc>
+          <w:tcPr>
+            <w:tcW w:type="dxa" w:w="3810"/>
+            <w:tcMar>
+              <w:top w:type="dxa" w:w="50"/>
+              <w:left w:type="dxa" w:w="90"/>
+              <w:bottom w:type="dxa" w:w="50"/>
+              <w:right w:type="dxa" w:w="90"/>
+            </w:tcMar>
+          </w:tcPr>
+          <w:p>
+            <w:pPr>
+              <w:keepNext w:val="false"/>
+              <w:spacing w:after="0" w:line="264" w:lineRule="auto"/>
+              <w:jc w:val="left"/>
+            </w:pPr>
+            <w:r>
+              <w:rPr>
+                <w:sz w:val="18"/>
+                <w:szCs w:val="18"/>
+              </w:rPr>
+              <w:t xml:space="preserve">Akuntansi, anggaran, perbendaharaan, perpajakan, pengelolaan SDM, organisasi, dan administrasi umum.</w:t>
+            </w:r>
+          </w:p>
+        </w:tc>
+      </w:tr>
+      <w:tr>
+        <w:trPr>
+          <w:cantSplit/>
+        </w:trPr>
+        <w:tc>
+          <w:tcPr>
+            <w:tcW w:type="dxa" w:w="2313"/>
+            <w:shd w:fill="F4F7FB" w:color="auto" w:val="clear"/>
+            <w:tcMar>
+              <w:top w:type="dxa" w:w="50"/>
+              <w:left w:type="dxa" w:w="90"/>
+              <w:bottom w:type="dxa" w:w="50"/>
+              <w:right w:type="dxa" w:w="90"/>
+            </w:tcMar>
+          </w:tcPr>
+          <w:p>
+            <w:pPr>
+              <w:keepNext w:val="false"/>
+              <w:spacing w:after="0" w:line="264" w:lineRule="auto"/>
+              <w:jc w:val="left"/>
+            </w:pPr>
+            <w:r>
+              <w:rPr>
+                <w:sz w:val="18"/>
+                <w:szCs w:val="18"/>
+              </w:rPr>
+              <w:t xml:space="preserve">Manager Teknik</w:t>
+            </w:r>
+          </w:p>
+        </w:tc>
+        <w:tc>
+          <w:tcPr>
+            <w:tcW w:type="dxa" w:w="3810"/>
+            <w:shd w:fill="F4F7FB" w:color="auto" w:val="clear"/>
+            <w:tcMar>
+              <w:top w:type="dxa" w:w="50"/>
+              <w:left w:type="dxa" w:w="90"/>
+              <w:bottom w:type="dxa" w:w="50"/>
+              <w:right w:type="dxa" w:w="90"/>
+            </w:tcMar>
+          </w:tcPr>
+          <w:p>
+            <w:pPr>
+              <w:keepNext w:val="false"/>
+              <w:spacing w:after="0" w:line="264" w:lineRule="auto"/>
+              <w:jc w:val="left"/>
+            </w:pPr>
+            <w:r>
+              <w:rPr>
+                <w:sz w:val="18"/>
+                <w:szCs w:val="18"/>
+              </w:rPr>
+              <w:t xml:space="preserve">Perawatan dan perbaikan armada, kesiapan kendaraan, serta fasilitas bengkel.</w:t>
+            </w:r>
+          </w:p>
+        </w:tc>
+      </w:tr>
+      <w:tr>
+        <w:trPr>
+          <w:cantSplit/>
+        </w:trPr>
+        <w:tc>
+          <w:tcPr>
+            <w:tcW w:type="dxa" w:w="2313"/>
+            <w:tcMar>
+              <w:top w:type="dxa" w:w="50"/>
+              <w:left w:type="dxa" w:w="90"/>
+              <w:bottom w:type="dxa" w:w="50"/>
+              <w:right w:type="dxa" w:w="90"/>
+            </w:tcMar>
+          </w:tcPr>
+          <w:p>
+            <w:pPr>
+              <w:keepNext w:val="false"/>
+              <w:spacing w:after="0" w:line="264" w:lineRule="auto"/>
+              <w:jc w:val="left"/>
+            </w:pPr>
+            <w:r>
+              <w:rPr>
+                <w:sz w:val="18"/>
+                <w:szCs w:val="18"/>
+              </w:rPr>
+              <w:t xml:space="preserve">Asisten Manager</w:t>
+            </w:r>
+          </w:p>
+        </w:tc>
+        <w:tc>
+          <w:tcPr>
+            <w:tcW w:type="dxa" w:w="3810"/>
+            <w:tcMar>
+              <w:top w:type="dxa" w:w="50"/>
+              <w:left w:type="dxa" w:w="90"/>
+              <w:bottom w:type="dxa" w:w="50"/>
+              <w:right w:type="dxa" w:w="90"/>
+            </w:tcMar>
+          </w:tcPr>
+          <w:p>
+            <w:pPr>
+              <w:keepNext w:val="false"/>
+              <w:spacing w:after="0" w:line="264" w:lineRule="auto"/>
+              <w:jc w:val="left"/>
+            </w:pPr>
+            <w:r>
+              <w:rPr>
+                <w:sz w:val="18"/>
+                <w:szCs w:val="18"/>
+              </w:rPr>
+              <w:t xml:space="preserve">Memimpin sub-bagian di bawah masing-masing manager.</w:t>
+            </w:r>
+          </w:p>
+        </w:tc>
+      </w:tr>
+      <w:tr>
+        <w:trPr>
+          <w:cantSplit/>
+        </w:trPr>
+        <w:tc>
+          <w:tcPr>
+            <w:tcW w:type="dxa" w:w="2313"/>
+            <w:shd w:fill="F4F7FB" w:color="auto" w:val="clear"/>
+            <w:tcMar>
+              <w:top w:type="dxa" w:w="50"/>
+              <w:left w:type="dxa" w:w="90"/>
+              <w:bottom w:type="dxa" w:w="50"/>
+              <w:right w:type="dxa" w:w="90"/>
+            </w:tcMar>
+          </w:tcPr>
+          <w:p>
+            <w:pPr>
+              <w:keepNext w:val="false"/>
+              <w:spacing w:after="0" w:line="264" w:lineRule="auto"/>
+              <w:jc w:val="left"/>
+            </w:pPr>
+            <w:r>
+              <w:rPr>
+                <w:sz w:val="18"/>
+                <w:szCs w:val="18"/>
+              </w:rPr>
+              <w:t xml:space="preserve">Staf dan pelaksana</w:t>
+            </w:r>
+          </w:p>
+        </w:tc>
+        <w:tc>
+          <w:tcPr>
+            <w:tcW w:type="dxa" w:w="3810"/>
+            <w:shd w:fill="F4F7FB" w:color="auto" w:val="clear"/>
+            <w:tcMar>
+              <w:top w:type="dxa" w:w="50"/>
+              <w:left w:type="dxa" w:w="90"/>
+              <w:bottom w:type="dxa" w:w="50"/>
+              <w:right w:type="dxa" w:w="90"/>
+            </w:tcMar>
+          </w:tcPr>
+          <w:p>
+            <w:pPr>
+              <w:keepNext w:val="false"/>
+              <w:spacing w:after="0" w:line="264" w:lineRule="auto"/>
+              <w:jc w:val="left"/>
+            </w:pPr>
+            <w:r>
+              <w:rPr>
+                <w:sz w:val="18"/>
+                <w:szCs w:val="18"/>
+              </w:rPr>
+              <w:t xml:space="preserve">Staf administrasi, petugas loket, pengemudi dan awak bus, serta mekanik.</w:t>
+            </w:r>
+          </w:p>
+        </w:tc>
+      </w:tr>
+    </w:tbl>
+    <w:p>
+      <w:pPr>
+        <w:spacing w:after="0" w:line="200" w:lineRule="auto"/>
+      </w:pPr>
+    </w:p>
+    <w:p>
+      <w:pPr>
+        <w:pStyle w:val="Panduan"/>
+      </w:pPr>
+      <w:r>
+        <w:t xml:space="preserve">Sesuaikan bagan dengan surat keputusan struktur organisasi DAMRI Cabang Bandar Lampung yang berlaku. Nama pejabat dapat ditambahkan bila diperlukan.</w:t>
+      </w:r>
+    </w:p>
+    <w:p>
+      <w:pPr>
         <w:pStyle w:val="Heading1"/>
         <w:pageBreakBefore/>
       </w:pPr>
-      <w:bookmarkStart w:name="_Toc000020" w:id="20"/>
+      <w:bookmarkStart w:name="_Toc000021" w:id="21"/>
       <w:r>
         <w:rPr>
           <w:color w:val="B45309"/>
@@ -5171,7 +5881,7 @@
         <w:br/>
         <w:t xml:space="preserve">LAYANAN DAMRI</w:t>
       </w:r>
-      <w:bookmarkEnd w:id="20"/>
+      <w:bookmarkEnd w:id="21"/>
     </w:p>
     <w:p>
       <w:pPr>
@@ -5185,11 +5895,11 @@
       <w:pPr>
         <w:pStyle w:val="Heading2"/>
       </w:pPr>
-      <w:bookmarkStart w:name="_Toc000021" w:id="21"/>
+      <w:bookmarkStart w:name="_Toc000022" w:id="22"/>
       <w:r>
         <w:t xml:space="preserve">5.1 Tujuh Segmen Layanan</w:t>
       </w:r>
-      <w:bookmarkEnd w:id="21"/>
+      <w:bookmarkEnd w:id="22"/>
     </w:p>
     <w:p>
       <w:pPr>
@@ -5698,11 +6408,11 @@
       <w:pPr>
         <w:pStyle w:val="Heading2"/>
       </w:pPr>
-      <w:bookmarkStart w:name="_Toc000022" w:id="22"/>
+      <w:bookmarkStart w:name="_Toc000023" w:id="23"/>
       <w:r>
         <w:t xml:space="preserve">5.2 Angkutan Bandara</w:t>
       </w:r>
-      <w:bookmarkEnd w:id="22"/>
+      <w:bookmarkEnd w:id="23"/>
     </w:p>
     <w:p>
       <w:pPr>
@@ -5724,11 +6434,11 @@
       <w:pPr>
         <w:pStyle w:val="Heading2"/>
       </w:pPr>
-      <w:bookmarkStart w:name="_Toc000023" w:id="23"/>
+      <w:bookmarkStart w:name="_Toc000024" w:id="24"/>
       <w:r>
         <w:t xml:space="preserve">5.3 Angkutan Antarkota</w:t>
       </w:r>
-      <w:bookmarkEnd w:id="23"/>
+      <w:bookmarkEnd w:id="24"/>
     </w:p>
     <w:p>
       <w:pPr>
@@ -5811,11 +6521,11 @@
       <w:pPr>
         <w:pStyle w:val="Heading2"/>
       </w:pPr>
-      <w:bookmarkStart w:name="_Toc000024" w:id="24"/>
+      <w:bookmarkStart w:name="_Toc000025" w:id="25"/>
       <w:r>
         <w:t xml:space="preserve">5.4 Angkutan Perkotaan</w:t>
       </w:r>
-      <w:bookmarkEnd w:id="24"/>
+      <w:bookmarkEnd w:id="25"/>
     </w:p>
     <w:p>
       <w:pPr>
@@ -5966,11 +6676,11 @@
       <w:pPr>
         <w:pStyle w:val="Heading2"/>
       </w:pPr>
-      <w:bookmarkStart w:name="_Toc000025" w:id="25"/>
+      <w:bookmarkStart w:name="_Toc000026" w:id="26"/>
       <w:r>
         <w:t xml:space="preserve">5.5 Angkutan Perintis</w:t>
       </w:r>
-      <w:bookmarkEnd w:id="25"/>
+      <w:bookmarkEnd w:id="26"/>
     </w:p>
     <w:p>
       <w:pPr>
@@ -6059,11 +6769,11 @@
       <w:pPr>
         <w:pStyle w:val="Heading2"/>
       </w:pPr>
-      <w:bookmarkStart w:name="_Toc000026" w:id="26"/>
+      <w:bookmarkStart w:name="_Toc000027" w:id="27"/>
       <w:r>
         <w:t xml:space="preserve">5.6 Angkutan Lintas Batas Negara</w:t>
       </w:r>
-      <w:bookmarkEnd w:id="26"/>
+      <w:bookmarkEnd w:id="27"/>
     </w:p>
     <w:p>
       <w:pPr>
@@ -6387,11 +7097,11 @@
       <w:pPr>
         <w:pStyle w:val="Heading2"/>
       </w:pPr>
-      <w:bookmarkStart w:name="_Toc000027" w:id="27"/>
+      <w:bookmarkStart w:name="_Toc000028" w:id="28"/>
       <w:r>
         <w:t xml:space="preserve">5.7 Pariwisata dan Logistik</w:t>
       </w:r>
-      <w:bookmarkEnd w:id="27"/>
+      <w:bookmarkEnd w:id="28"/>
     </w:p>
     <w:p>
       <w:pPr>
@@ -6428,7 +7138,7 @@
         <w:pStyle w:val="Heading1"/>
         <w:pageBreakBefore/>
       </w:pPr>
-      <w:bookmarkStart w:name="_Toc000028" w:id="28"/>
+      <w:bookmarkStart w:name="_Toc000029" w:id="29"/>
       <w:r>
         <w:rPr>
           <w:color w:val="B45309"/>
@@ -6442,7 +7152,7 @@
         <w:br/>
         <w:t xml:space="preserve">DAMRI CABANG BANDAR LAMPUNG</w:t>
       </w:r>
-      <w:bookmarkEnd w:id="28"/>
+      <w:bookmarkEnd w:id="29"/>
     </w:p>
     <w:p>
       <w:pPr>
@@ -6456,11 +7166,11 @@
       <w:pPr>
         <w:pStyle w:val="Heading2"/>
       </w:pPr>
-      <w:bookmarkStart w:name="_Toc000029" w:id="29"/>
+      <w:bookmarkStart w:name="_Toc000030" w:id="30"/>
       <w:r>
         <w:t xml:space="preserve">6.1 Profil Cabang</w:t>
       </w:r>
-      <w:bookmarkEnd w:id="29"/>
+      <w:bookmarkEnd w:id="30"/>
     </w:p>
     <w:p>
       <w:pPr>
@@ -6475,7 +7185,7 @@
         <w:keepNext w:val="false"/>
       </w:pPr>
       <w:r>
-        <w:t xml:space="preserve">Cabang ini dipimpin oleh seorang General Manager dan didukung bagian-bagian yang menangani operasional, teknik, pelayanan, keuangan, serta sumber daya manusia.</w:t>
+        <w:t xml:space="preserve">Cabang ini dipimpin oleh seorang General Manager yang dibantu Manager Usaha, Manager Keuangan, SDM dan Umum, serta Manager Teknik. Susunan organisasinya dijelaskan pada subbab 4.3.</w:t>
       </w:r>
     </w:p>
     <w:tbl>
@@ -6688,11 +7398,11 @@
       <w:pPr>
         <w:pStyle w:val="Heading2"/>
       </w:pPr>
-      <w:bookmarkStart w:name="_Toc000030" w:id="30"/>
+      <w:bookmarkStart w:name="_Toc000031" w:id="31"/>
       <w:r>
         <w:t xml:space="preserve">6.2 Trayek dan Layanan di Lampung</w:t>
       </w:r>
-      <w:bookmarkEnd w:id="30"/>
+      <w:bookmarkEnd w:id="31"/>
     </w:p>
     <w:p>
       <w:pPr>
@@ -7241,11 +7951,11 @@
       <w:pPr>
         <w:pStyle w:val="Heading2"/>
       </w:pPr>
-      <w:bookmarkStart w:name="_Toc000031" w:id="31"/>
+      <w:bookmarkStart w:name="_Toc000032" w:id="32"/>
       <w:r>
         <w:t xml:space="preserve">6.3 Sarana dan Fasilitas</w:t>
       </w:r>
-      <w:bookmarkEnd w:id="31"/>
+      <w:bookmarkEnd w:id="32"/>
     </w:p>
     <w:p>
       <w:pPr>
@@ -7720,7 +8430,7 @@
         <w:pStyle w:val="Heading1"/>
         <w:pageBreakBefore/>
       </w:pPr>
-      <w:bookmarkStart w:name="_Toc000032" w:id="32"/>
+      <w:bookmarkStart w:name="_Toc000033" w:id="33"/>
       <w:r>
         <w:rPr>
           <w:color w:val="B45309"/>
@@ -7734,7 +8444,7 @@
         <w:br/>
         <w:t xml:space="preserve">KESELAMATAN DAN PELAYANAN</w:t>
       </w:r>
-      <w:bookmarkEnd w:id="32"/>
+      <w:bookmarkEnd w:id="33"/>
     </w:p>
     <w:p>
       <w:pPr>
@@ -7748,11 +8458,11 @@
       <w:pPr>
         <w:pStyle w:val="Heading2"/>
       </w:pPr>
-      <w:bookmarkStart w:name="_Toc000033" w:id="33"/>
+      <w:bookmarkStart w:name="_Toc000034" w:id="34"/>
       <w:r>
         <w:t xml:space="preserve">7.1 Budaya Keselamatan</w:t>
       </w:r>
-      <w:bookmarkEnd w:id="33"/>
+      <w:bookmarkEnd w:id="34"/>
     </w:p>
     <w:p>
       <w:pPr>
@@ -8051,11 +8761,11 @@
       <w:pPr>
         <w:pStyle w:val="Heading2"/>
       </w:pPr>
-      <w:bookmarkStart w:name="_Toc000034" w:id="34"/>
+      <w:bookmarkStart w:name="_Toc000035" w:id="35"/>
       <w:r>
         <w:t xml:space="preserve">7.2 Standar Pelayanan Minimal</w:t>
       </w:r>
-      <w:bookmarkEnd w:id="34"/>
+      <w:bookmarkEnd w:id="35"/>
     </w:p>
     <w:p>
       <w:pPr>
@@ -8499,11 +9209,11 @@
       <w:pPr>
         <w:pStyle w:val="Heading2"/>
       </w:pPr>
-      <w:bookmarkStart w:name="_Toc000035" w:id="35"/>
+      <w:bookmarkStart w:name="_Toc000036" w:id="36"/>
       <w:r>
         <w:t xml:space="preserve">7.3 Pemesanan Tiket dan Pengaduan</w:t>
       </w:r>
-      <w:bookmarkEnd w:id="35"/>
+      <w:bookmarkEnd w:id="36"/>
     </w:p>
     <w:p>
       <w:pPr>
@@ -9119,7 +9829,7 @@
         <w:pStyle w:val="Heading1"/>
         <w:pageBreakBefore/>
       </w:pPr>
-      <w:bookmarkStart w:name="_Toc000036" w:id="36"/>
+      <w:bookmarkStart w:name="_Toc000037" w:id="37"/>
       <w:r>
         <w:rPr>
           <w:color w:val="B45309"/>
@@ -9133,7 +9843,7 @@
         <w:br/>
         <w:t xml:space="preserve">INSAN DAMRI</w:t>
       </w:r>
-      <w:bookmarkEnd w:id="36"/>
+      <w:bookmarkEnd w:id="37"/>
     </w:p>
     <w:p>
       <w:pPr>
@@ -9147,11 +9857,11 @@
       <w:pPr>
         <w:pStyle w:val="Heading2"/>
       </w:pPr>
-      <w:bookmarkStart w:name="_Toc000037" w:id="37"/>
+      <w:bookmarkStart w:name="_Toc000038" w:id="38"/>
       <w:r>
         <w:t xml:space="preserve">8.1 Pengembangan Kompetensi</w:t>
       </w:r>
-      <w:bookmarkEnd w:id="37"/>
+      <w:bookmarkEnd w:id="38"/>
     </w:p>
     <w:p>
       <w:pPr>
@@ -9550,11 +10260,11 @@
       <w:pPr>
         <w:pStyle w:val="Heading2"/>
       </w:pPr>
-      <w:bookmarkStart w:name="_Toc000038" w:id="38"/>
+      <w:bookmarkStart w:name="_Toc000039" w:id="39"/>
       <w:r>
         <w:t xml:space="preserve">8.2 Hak dan Kewajiban Karyawan</w:t>
       </w:r>
-      <w:bookmarkEnd w:id="38"/>
+      <w:bookmarkEnd w:id="39"/>
     </w:p>
     <w:p>
       <w:pPr>
@@ -9990,11 +10700,11 @@
       <w:pPr>
         <w:pStyle w:val="Heading2"/>
       </w:pPr>
-      <w:bookmarkStart w:name="_Toc000039" w:id="39"/>
+      <w:bookmarkStart w:name="_Toc000040" w:id="40"/>
       <w:r>
         <w:t xml:space="preserve">8.3 Menjadi Duta DAMRI</w:t>
       </w:r>
-      <w:bookmarkEnd w:id="39"/>
+      <w:bookmarkEnd w:id="40"/>
     </w:p>
     <w:p>
       <w:pPr>
@@ -10157,11 +10867,11 @@
         <w:pStyle w:val="Heading1"/>
         <w:pageBreakBefore/>
       </w:pPr>
-      <w:bookmarkStart w:name="_Toc000040" w:id="40"/>
+      <w:bookmarkStart w:name="_Toc000041" w:id="41"/>
       <w:r>
         <w:t xml:space="preserve">PENUTUP</w:t>
       </w:r>
-      <w:bookmarkEnd w:id="40"/>
+      <w:bookmarkEnd w:id="41"/>
     </w:p>
     <w:p>
       <w:r>
@@ -10188,11 +10898,11 @@
         <w:pStyle w:val="Heading1"/>
         <w:pageBreakBefore/>
       </w:pPr>
-      <w:bookmarkStart w:name="_Toc000041" w:id="41"/>
+      <w:bookmarkStart w:name="_Toc000042" w:id="42"/>
       <w:r>
         <w:t xml:space="preserve">DAFTAR PUSTAKA</w:t>
       </w:r>
-      <w:bookmarkEnd w:id="41"/>
+      <w:bookmarkEnd w:id="42"/>
     </w:p>
     <w:p>
       <w:pPr>

</xml_diff>